<commit_message>
Add GitHub link to the report
</commit_message>
<xml_diff>
--- a/Online Food Ordering - DV Mini Project Report.docx
+++ b/Online Food Ordering - DV Mini Project Report.docx
@@ -52,10 +52,10 @@
       </w:r>
       <w:r>
         <w:rPr>
-          <w:highlight w:val="yellow"/>
-          <w:highlightCs w:val="yellow"/>
+          <w:color w:val="0563C1"/>
+          <w:u w:val="single"/>
         </w:rPr>
-        <w:t xml:space="preserve">[add GitHub link here]</w:t>
+        <w:t xml:space="preserve">https://github.com/paramagarwal216-commits/Preditive_modeling</w:t>
       </w:r>
     </w:p>
     <w:p>
@@ -6678,10 +6678,10 @@
       </w:r>
       <w:r>
         <w:rPr>
-          <w:highlight w:val="yellow"/>
-          <w:highlightCs w:val="yellow"/>
+          <w:color w:val="0563C1"/>
+          <w:u w:val="single"/>
         </w:rPr>
-        <w:t xml:space="preserve">[add GitHub link here]</w:t>
+        <w:t xml:space="preserve">https://github.com/paramagarwal216-commits/Preditive_modeling</w:t>
       </w:r>
     </w:p>
     <w:p>

</xml_diff>

<commit_message>
Add live web app link to the report
</commit_message>
<xml_diff>
--- a/Online Food Ordering - DV Mini Project Report.docx
+++ b/Online Food Ordering - DV Mini Project Report.docx
@@ -56,6 +56,22 @@
           <w:u w:val="single"/>
         </w:rPr>
         <w:t xml:space="preserve">https://github.com/paramagarwal216-commits/Preditive_modeling</w:t>
+      </w:r>
+    </w:p>
+    <w:p>
+      <w:r>
+        <w:rPr>
+          <w:b/>
+          <w:bCs/>
+        </w:rPr>
+        <w:t xml:space="preserve">Live web app: </w:t>
+      </w:r>
+      <w:r>
+        <w:rPr>
+          <w:color w:val="0563C1"/>
+          <w:u w:val="single"/>
+        </w:rPr>
+        <w:t xml:space="preserve">https://paramagarwal216-commits.github.io/Preditive_modeling/</w:t>
       </w:r>
     </w:p>
     <w:p>
@@ -6682,6 +6698,25 @@
           <w:u w:val="single"/>
         </w:rPr>
         <w:t xml:space="preserve">https://github.com/paramagarwal216-commits/Preditive_modeling</w:t>
+      </w:r>
+    </w:p>
+    <w:p>
+      <w:pPr>
+        <w:pStyle w:val="ListParagraph"/>
+        <w:numPr>
+          <w:ilvl w:val="0"/>
+          <w:numId w:val="2"/>
+        </w:numPr>
+      </w:pPr>
+      <w:r>
+        <w:t xml:space="preserve">Live web app (GitHub Pages): </w:t>
+      </w:r>
+      <w:r>
+        <w:rPr>
+          <w:color w:val="0563C1"/>
+          <w:u w:val="single"/>
+        </w:rPr>
+        <w:t xml:space="preserve">https://paramagarwal216-commits.github.io/Preditive_modeling/</w:t>
       </w:r>
     </w:p>
     <w:p>

</xml_diff>